<commit_message>
fix: 同步 5/18 5/20 資料 + 重生提案 (192 樣本/67%) + 補修講稿 stale
問題 1: 本機落後線上 5 天
  - GitHub Actions 5/18 + 5/20 自動 commit 了新資料
  - 本機沒 git pull 所以 backtest 用舊 185 樣本算
  - 提案三件套上次重生時拉到舊數字

問題 2: 講稿 build_script.js 有 1 處硬寫 99 沒拉動態
  - line 204: 「在這 99 個樣本中」(範例語句)
  - 改為 ${SAMPLES} template literal

解決步驟:
1. git pull → 拉到 5/18, 5/20 daily
2. 不重跑 run_backtest (保留線上 192 樣本版避免微差)
3. 重生 3 件提案 (拉 192 樣本/67%/+2.42%)
4. 修補 build_script.js 第 204 行 stale 99
5. 重生 LINE post 2026-05-21

最終驗證:
  pptx:       67%×2 / 192×8 / +2.42×1  ✓
  提案書:     67%×5 / 192×11 / +2.42×3 ✓
  講稿:       67%×15 / 192×10 / +2.42×2  ✓ (stale 99 已修)

  data/backtest.json: 192 樣本 67% +2.42% (5/20 線上版)
  line_post/: 2026-05-21 觀察名單已產出

Co-Authored-By: Claude Opus 4.6 (1M context) <noreply@anthropic.com>
</commit_message>
<xml_diff>
--- a/proposal/股文觀指_商業提案書.docx
+++ b/proposal/股文觀指_商業提案書.docx
@@ -160,7 +160,7 @@
           <w:sz w:val="22"/>
           <w:szCs w:val="22"/>
         </w:rPr>
-        <w:t xml:space="preserve">平台最重要的差異化在於提供「可驗證的回測結果」：以 TWSE 真實隔日 OHLC 計算，10 天 185 樣本（樣本加權，非日均）的隔日開盤勝率達 70%（130/185），平均開盤報酬 +2.58%。所有計算方法、原始資料與程式碼皆公開透明。</w:t>
+        <w:t xml:space="preserve">平台最重要的差異化在於提供「可驗證的回測結果」：以 TWSE 真實隔日 OHLC 計算，10 天 192 樣本（樣本加權，非日均）的隔日開盤勝率達 67%（128/192），平均開盤報酬 +2.42%。所有計算方法、原始資料與程式碼皆公開透明。</w:t>
       </w:r>
     </w:p>
     <w:p>
@@ -260,7 +260,7 @@
                 <w:sz w:val="20"/>
                 <w:szCs w:val="20"/>
               </w:rPr>
-              <w:t xml:space="preserve">10 天 185 樣本回測：隔日開盤勝率 70%（130/185），平均開盤報酬 +2.58%。</w:t>
+              <w:t xml:space="preserve">10 天 192 樣本回測：隔日開盤勝率 67%（128/192），平均開盤報酬 +2.42%。</w:t>
             </w:r>
           </w:p>
         </w:tc>
@@ -1664,7 +1664,7 @@
           <w:sz w:val="22"/>
           <w:szCs w:val="22"/>
         </w:rPr>
-        <w:t xml:space="preserve">以下數據基於 10 個交易日、185 個實際樣本，由腳本「scripts/run_backtest.py」執行：對每個歷史「明日焦點」標的，向 TWSE/TPEx 抓取真實隔日 OHLC，計算「（隔日開盤 − 漲停日收盤）÷ 漲停日收盤」與「（隔日收盤 − 漲停日收盤）÷ 漲停日收盤」。所有數字為樣本加權平均，不含任何估算值。</w:t>
+        <w:t xml:space="preserve">以下數據基於 10 個交易日、192 個實際樣本，由腳本「scripts/run_backtest.py」執行：對每個歷史「明日焦點」標的，向 TWSE/TPEx 抓取真實隔日 OHLC，計算「（隔日開盤 − 漲停日收盤）÷ 漲停日收盤」與「（隔日收盤 − 漲停日收盤）÷ 漲停日收盤」。所有數字為樣本加權平均，不含任何估算值。</w:t>
       </w:r>
     </w:p>
     <w:p>
@@ -1722,7 +1722,7 @@
                 <w:sz w:val="96"/>
                 <w:szCs w:val="96"/>
               </w:rPr>
-              <w:t xml:space="preserve">70%</w:t>
+              <w:t xml:space="preserve">67%</w:t>
             </w:r>
           </w:p>
           <w:p>
@@ -1736,7 +1736,7 @@
                 <w:sz w:val="22"/>
                 <w:szCs w:val="22"/>
               </w:rPr>
-              <w:t xml:space="preserve">隔日開盤勝率（130 / 185）</w:t>
+              <w:t xml:space="preserve">隔日開盤勝率（128 / 192）</w:t>
             </w:r>
           </w:p>
         </w:tc>
@@ -1799,7 +1799,7 @@
                 <w:sz w:val="48"/>
                 <w:szCs w:val="48"/>
               </w:rPr>
-              <w:t xml:space="preserve">+2.58%</w:t>
+              <w:t xml:space="preserve">+2.42%</w:t>
             </w:r>
           </w:p>
           <w:p>
@@ -1848,7 +1848,7 @@
                 <w:sz w:val="48"/>
                 <w:szCs w:val="48"/>
               </w:rPr>
-              <w:t xml:space="preserve">59%</w:t>
+              <w:t xml:space="preserve">55%</w:t>
             </w:r>
           </w:p>
           <w:p>
@@ -1897,7 +1897,7 @@
                 <w:sz w:val="48"/>
                 <w:szCs w:val="48"/>
               </w:rPr>
-              <w:t xml:space="preserve">+2.09%</w:t>
+              <w:t xml:space="preserve">+1.59%</w:t>
             </w:r>
           </w:p>
           <w:p>
@@ -2237,7 +2237,7 @@
                 <w:sz w:val="20"/>
                 <w:szCs w:val="20"/>
               </w:rPr>
-              <w:t xml:space="preserve">2026-05-14</w:t>
+              <w:t xml:space="preserve">2026-05-18</w:t>
             </w:r>
           </w:p>
         </w:tc>
@@ -2271,7 +2271,7 @@
                 <w:sz w:val="20"/>
                 <w:szCs w:val="20"/>
               </w:rPr>
-              <w:t xml:space="preserve">2026-05-15</w:t>
+              <w:t xml:space="preserve">2026-05-20</w:t>
             </w:r>
           </w:p>
         </w:tc>
@@ -2339,7 +2339,7 @@
                 <w:sz w:val="20"/>
                 <w:szCs w:val="20"/>
               </w:rPr>
-              <w:t xml:space="preserve">55%</w:t>
+              <w:t xml:space="preserve">75%</w:t>
             </w:r>
           </w:p>
         </w:tc>
@@ -2373,7 +2373,7 @@
                 <w:sz w:val="20"/>
                 <w:szCs w:val="20"/>
               </w:rPr>
-              <w:t xml:space="preserve">+1.33%</w:t>
+              <w:t xml:space="preserve">+2.86%</w:t>
             </w:r>
           </w:p>
         </w:tc>
@@ -2407,7 +2407,7 @@
                 <w:sz w:val="20"/>
                 <w:szCs w:val="20"/>
               </w:rPr>
-              <w:t xml:space="preserve">40%</w:t>
+              <w:t xml:space="preserve">60%</w:t>
             </w:r>
           </w:p>
         </w:tc>
@@ -2441,7 +2441,7 @@
                 <w:sz w:val="20"/>
                 <w:szCs w:val="20"/>
               </w:rPr>
-              <w:t xml:space="preserve">-0.85%</w:t>
+              <w:t xml:space="preserve">+2.06%</w:t>
             </w:r>
           </w:p>
         </w:tc>
@@ -2477,7 +2477,7 @@
                 <w:sz w:val="20"/>
                 <w:szCs w:val="20"/>
               </w:rPr>
-              <w:t xml:space="preserve">2026-05-13</w:t>
+              <w:t xml:space="preserve">2026-05-15</w:t>
             </w:r>
           </w:p>
         </w:tc>
@@ -2511,7 +2511,7 @@
                 <w:sz w:val="20"/>
                 <w:szCs w:val="20"/>
               </w:rPr>
-              <w:t xml:space="preserve">2026-05-14</w:t>
+              <w:t xml:space="preserve">2026-05-18</w:t>
             </w:r>
           </w:p>
         </w:tc>
@@ -2579,7 +2579,7 @@
                 <w:sz w:val="20"/>
                 <w:szCs w:val="20"/>
               </w:rPr>
-              <w:t xml:space="preserve">80%</w:t>
+              <w:t xml:space="preserve">50%</w:t>
             </w:r>
           </w:p>
         </w:tc>
@@ -2613,7 +2613,7 @@
                 <w:sz w:val="20"/>
                 <w:szCs w:val="20"/>
               </w:rPr>
-              <w:t xml:space="preserve">+4.1%</w:t>
+              <w:t xml:space="preserve">+0.9%</w:t>
             </w:r>
           </w:p>
         </w:tc>
@@ -2647,7 +2647,7 @@
                 <w:sz w:val="20"/>
                 <w:szCs w:val="20"/>
               </w:rPr>
-              <w:t xml:space="preserve">50%</w:t>
+              <w:t xml:space="preserve">60%</w:t>
             </w:r>
           </w:p>
         </w:tc>
@@ -2681,7 +2681,7 @@
                 <w:sz w:val="20"/>
                 <w:szCs w:val="20"/>
               </w:rPr>
-              <w:t xml:space="preserve">+0.97%</w:t>
+              <w:t xml:space="preserve">+1.36%</w:t>
             </w:r>
           </w:p>
         </w:tc>
@@ -2717,7 +2717,7 @@
                 <w:sz w:val="20"/>
                 <w:szCs w:val="20"/>
               </w:rPr>
-              <w:t xml:space="preserve">2026-05-12</w:t>
+              <w:t xml:space="preserve">2026-05-14</w:t>
             </w:r>
           </w:p>
         </w:tc>
@@ -2751,7 +2751,7 @@
                 <w:sz w:val="20"/>
                 <w:szCs w:val="20"/>
               </w:rPr>
-              <w:t xml:space="preserve">2026-05-13</w:t>
+              <w:t xml:space="preserve">2026-05-15</w:t>
             </w:r>
           </w:p>
         </w:tc>
@@ -2819,7 +2819,7 @@
                 <w:sz w:val="20"/>
                 <w:szCs w:val="20"/>
               </w:rPr>
-              <w:t xml:space="preserve">25%</w:t>
+              <w:t xml:space="preserve">55%</w:t>
             </w:r>
           </w:p>
         </w:tc>
@@ -2853,7 +2853,7 @@
                 <w:sz w:val="20"/>
                 <w:szCs w:val="20"/>
               </w:rPr>
-              <w:t xml:space="preserve">-0.24%</w:t>
+              <w:t xml:space="preserve">+1.33%</w:t>
             </w:r>
           </w:p>
         </w:tc>
@@ -2887,7 +2887,7 @@
                 <w:sz w:val="20"/>
                 <w:szCs w:val="20"/>
               </w:rPr>
-              <w:t xml:space="preserve">45%</w:t>
+              <w:t xml:space="preserve">40%</w:t>
             </w:r>
           </w:p>
         </w:tc>
@@ -2921,7 +2921,7 @@
                 <w:sz w:val="20"/>
                 <w:szCs w:val="20"/>
               </w:rPr>
-              <w:t xml:space="preserve">+0.83%</w:t>
+              <w:t xml:space="preserve">-0.85%</w:t>
             </w:r>
           </w:p>
         </w:tc>
@@ -2957,7 +2957,7 @@
                 <w:sz w:val="20"/>
                 <w:szCs w:val="20"/>
               </w:rPr>
-              <w:t xml:space="preserve">2026-05-11</w:t>
+              <w:t xml:space="preserve">2026-05-13</w:t>
             </w:r>
           </w:p>
         </w:tc>
@@ -2991,7 +2991,7 @@
                 <w:sz w:val="20"/>
                 <w:szCs w:val="20"/>
               </w:rPr>
-              <w:t xml:space="preserve">2026-05-12</w:t>
+              <w:t xml:space="preserve">2026-05-14</w:t>
             </w:r>
           </w:p>
         </w:tc>
@@ -3059,7 +3059,7 @@
                 <w:sz w:val="20"/>
                 <w:szCs w:val="20"/>
               </w:rPr>
-              <w:t xml:space="preserve">95%</w:t>
+              <w:t xml:space="preserve">80%</w:t>
             </w:r>
           </w:p>
         </w:tc>
@@ -3093,7 +3093,7 @@
                 <w:sz w:val="20"/>
                 <w:szCs w:val="20"/>
               </w:rPr>
-              <w:t xml:space="preserve">+3.91%</w:t>
+              <w:t xml:space="preserve">+4.11%</w:t>
             </w:r>
           </w:p>
         </w:tc>
@@ -3127,7 +3127,7 @@
                 <w:sz w:val="20"/>
                 <w:szCs w:val="20"/>
               </w:rPr>
-              <w:t xml:space="preserve">80%</w:t>
+              <w:t xml:space="preserve">50%</w:t>
             </w:r>
           </w:p>
         </w:tc>
@@ -3161,7 +3161,7 @@
                 <w:sz w:val="20"/>
                 <w:szCs w:val="20"/>
               </w:rPr>
-              <w:t xml:space="preserve">+4.98%</w:t>
+              <w:t xml:space="preserve">+0.97%</w:t>
             </w:r>
           </w:p>
         </w:tc>
@@ -3197,7 +3197,7 @@
                 <w:sz w:val="20"/>
                 <w:szCs w:val="20"/>
               </w:rPr>
-              <w:t xml:space="preserve">2026-05-08</w:t>
+              <w:t xml:space="preserve">2026-05-12</w:t>
             </w:r>
           </w:p>
         </w:tc>
@@ -3231,7 +3231,7 @@
                 <w:sz w:val="20"/>
                 <w:szCs w:val="20"/>
               </w:rPr>
-              <w:t xml:space="preserve">2026-05-11</w:t>
+              <w:t xml:space="preserve">2026-05-13</w:t>
             </w:r>
           </w:p>
         </w:tc>
@@ -3299,7 +3299,7 @@
                 <w:sz w:val="20"/>
                 <w:szCs w:val="20"/>
               </w:rPr>
-              <w:t xml:space="preserve">65%</w:t>
+              <w:t xml:space="preserve">25%</w:t>
             </w:r>
           </w:p>
         </w:tc>
@@ -3333,7 +3333,7 @@
                 <w:sz w:val="20"/>
                 <w:szCs w:val="20"/>
               </w:rPr>
-              <w:t xml:space="preserve">+2.14%</w:t>
+              <w:t xml:space="preserve">-0.24%</w:t>
             </w:r>
           </w:p>
         </w:tc>
@@ -3367,7 +3367,7 @@
                 <w:sz w:val="20"/>
                 <w:szCs w:val="20"/>
               </w:rPr>
-              <w:t xml:space="preserve">60%</w:t>
+              <w:t xml:space="preserve">45%</w:t>
             </w:r>
           </w:p>
         </w:tc>
@@ -3401,7 +3401,7 @@
                 <w:sz w:val="20"/>
                 <w:szCs w:val="20"/>
               </w:rPr>
-              <w:t xml:space="preserve">+3.22%</w:t>
+              <w:t xml:space="preserve">+0.83%</w:t>
             </w:r>
           </w:p>
         </w:tc>
@@ -3437,7 +3437,7 @@
                 <w:sz w:val="20"/>
                 <w:szCs w:val="20"/>
               </w:rPr>
-              <w:t xml:space="preserve">2026-05-07</w:t>
+              <w:t xml:space="preserve">2026-05-11</w:t>
             </w:r>
           </w:p>
         </w:tc>
@@ -3471,7 +3471,7 @@
                 <w:sz w:val="20"/>
                 <w:szCs w:val="20"/>
               </w:rPr>
-              <w:t xml:space="preserve">2026-05-08</w:t>
+              <w:t xml:space="preserve">2026-05-12</w:t>
             </w:r>
           </w:p>
         </w:tc>
@@ -3539,7 +3539,7 @@
                 <w:sz w:val="20"/>
                 <w:szCs w:val="20"/>
               </w:rPr>
-              <w:t xml:space="preserve">50%</w:t>
+              <w:t xml:space="preserve">95%</w:t>
             </w:r>
           </w:p>
         </w:tc>
@@ -3573,7 +3573,7 @@
                 <w:sz w:val="20"/>
                 <w:szCs w:val="20"/>
               </w:rPr>
-              <w:t xml:space="preserve">+0.49%</w:t>
+              <w:t xml:space="preserve">+3.91%</w:t>
             </w:r>
           </w:p>
         </w:tc>
@@ -3607,7 +3607,7 @@
                 <w:sz w:val="20"/>
                 <w:szCs w:val="20"/>
               </w:rPr>
-              <w:t xml:space="preserve">35%</w:t>
+              <w:t xml:space="preserve">80%</w:t>
             </w:r>
           </w:p>
         </w:tc>
@@ -3641,7 +3641,7 @@
                 <w:sz w:val="20"/>
                 <w:szCs w:val="20"/>
               </w:rPr>
-              <w:t xml:space="preserve">-1.4%</w:t>
+              <w:t xml:space="preserve">+4.98%</w:t>
             </w:r>
           </w:p>
         </w:tc>
@@ -3677,7 +3677,7 @@
                 <w:sz w:val="20"/>
                 <w:szCs w:val="20"/>
               </w:rPr>
-              <w:t xml:space="preserve">2026-05-06</w:t>
+              <w:t xml:space="preserve">2026-05-08</w:t>
             </w:r>
           </w:p>
         </w:tc>
@@ -3711,7 +3711,7 @@
                 <w:sz w:val="20"/>
                 <w:szCs w:val="20"/>
               </w:rPr>
-              <w:t xml:space="preserve">2026-05-07</w:t>
+              <w:t xml:space="preserve">2026-05-11</w:t>
             </w:r>
           </w:p>
         </w:tc>
@@ -3745,7 +3745,7 @@
                 <w:sz w:val="20"/>
                 <w:szCs w:val="20"/>
               </w:rPr>
-              <w:t xml:space="preserve">12</w:t>
+              <w:t xml:space="preserve">20</w:t>
             </w:r>
           </w:p>
         </w:tc>
@@ -3779,7 +3779,7 @@
                 <w:sz w:val="20"/>
                 <w:szCs w:val="20"/>
               </w:rPr>
-              <w:t xml:space="preserve">92%</w:t>
+              <w:t xml:space="preserve">65%</w:t>
             </w:r>
           </w:p>
         </w:tc>
@@ -3813,7 +3813,7 @@
                 <w:sz w:val="20"/>
                 <w:szCs w:val="20"/>
               </w:rPr>
-              <w:t xml:space="preserve">+4.48%</w:t>
+              <w:t xml:space="preserve">+2.14%</w:t>
             </w:r>
           </w:p>
         </w:tc>
@@ -3847,7 +3847,7 @@
                 <w:sz w:val="20"/>
                 <w:szCs w:val="20"/>
               </w:rPr>
-              <w:t xml:space="preserve">83%</w:t>
+              <w:t xml:space="preserve">60%</w:t>
             </w:r>
           </w:p>
         </w:tc>
@@ -3881,7 +3881,7 @@
                 <w:sz w:val="20"/>
                 <w:szCs w:val="20"/>
               </w:rPr>
-              <w:t xml:space="preserve">+4.51%</w:t>
+              <w:t xml:space="preserve">+3.22%</w:t>
             </w:r>
           </w:p>
         </w:tc>
@@ -3917,7 +3917,7 @@
                 <w:sz w:val="20"/>
                 <w:szCs w:val="20"/>
               </w:rPr>
-              <w:t xml:space="preserve">2026-05-05</w:t>
+              <w:t xml:space="preserve">2026-05-07</w:t>
             </w:r>
           </w:p>
         </w:tc>
@@ -3951,7 +3951,7 @@
                 <w:sz w:val="20"/>
                 <w:szCs w:val="20"/>
               </w:rPr>
-              <w:t xml:space="preserve">2026-05-06</w:t>
+              <w:t xml:space="preserve">2026-05-08</w:t>
             </w:r>
           </w:p>
         </w:tc>
@@ -4019,7 +4019,7 @@
                 <w:sz w:val="20"/>
                 <w:szCs w:val="20"/>
               </w:rPr>
-              <w:t xml:space="preserve">90%</w:t>
+              <w:t xml:space="preserve">50%</w:t>
             </w:r>
           </w:p>
         </w:tc>
@@ -4053,7 +4053,7 @@
                 <w:sz w:val="20"/>
                 <w:szCs w:val="20"/>
               </w:rPr>
-              <w:t xml:space="preserve">+5.07%</w:t>
+              <w:t xml:space="preserve">+0.49%</w:t>
             </w:r>
           </w:p>
         </w:tc>
@@ -4087,7 +4087,7 @@
                 <w:sz w:val="20"/>
                 <w:szCs w:val="20"/>
               </w:rPr>
-              <w:t xml:space="preserve">50%</w:t>
+              <w:t xml:space="preserve">35%</w:t>
             </w:r>
           </w:p>
         </w:tc>
@@ -4121,7 +4121,7 @@
                 <w:sz w:val="20"/>
                 <w:szCs w:val="20"/>
               </w:rPr>
-              <w:t xml:space="preserve">+1.38%</w:t>
+              <w:t xml:space="preserve">-1.4%</w:t>
             </w:r>
           </w:p>
         </w:tc>
@@ -4157,7 +4157,7 @@
                 <w:sz w:val="20"/>
                 <w:szCs w:val="20"/>
               </w:rPr>
-              <w:t xml:space="preserve">2026-05-04</w:t>
+              <w:t xml:space="preserve">2026-05-06</w:t>
             </w:r>
           </w:p>
         </w:tc>
@@ -4191,7 +4191,7 @@
                 <w:sz w:val="20"/>
                 <w:szCs w:val="20"/>
               </w:rPr>
-              <w:t xml:space="preserve">2026-05-05</w:t>
+              <w:t xml:space="preserve">2026-05-07</w:t>
             </w:r>
           </w:p>
         </w:tc>
@@ -4225,7 +4225,7 @@
                 <w:sz w:val="20"/>
                 <w:szCs w:val="20"/>
               </w:rPr>
-              <w:t xml:space="preserve">20</w:t>
+              <w:t xml:space="preserve">12</w:t>
             </w:r>
           </w:p>
         </w:tc>
@@ -4259,7 +4259,7 @@
                 <w:sz w:val="20"/>
                 <w:szCs w:val="20"/>
               </w:rPr>
-              <w:t xml:space="preserve">70%</w:t>
+              <w:t xml:space="preserve">92%</w:t>
             </w:r>
           </w:p>
         </w:tc>
@@ -4293,7 +4293,7 @@
                 <w:sz w:val="20"/>
                 <w:szCs w:val="20"/>
               </w:rPr>
-              <w:t xml:space="preserve">+1.1%</w:t>
+              <w:t xml:space="preserve">+4.48%</w:t>
             </w:r>
           </w:p>
         </w:tc>
@@ -4327,7 +4327,7 @@
                 <w:sz w:val="20"/>
                 <w:szCs w:val="20"/>
               </w:rPr>
-              <w:t xml:space="preserve">85%</w:t>
+              <w:t xml:space="preserve">83%</w:t>
             </w:r>
           </w:p>
         </w:tc>
@@ -4361,7 +4361,7 @@
                 <w:sz w:val="20"/>
                 <w:szCs w:val="20"/>
               </w:rPr>
-              <w:t xml:space="preserve">+4%</w:t>
+              <w:t xml:space="preserve">+4.51%</w:t>
             </w:r>
           </w:p>
         </w:tc>
@@ -4397,7 +4397,7 @@
                 <w:sz w:val="20"/>
                 <w:szCs w:val="20"/>
               </w:rPr>
-              <w:t xml:space="preserve">2026-04-30</w:t>
+              <w:t xml:space="preserve">2026-05-05</w:t>
             </w:r>
           </w:p>
         </w:tc>
@@ -4431,7 +4431,7 @@
                 <w:sz w:val="20"/>
                 <w:szCs w:val="20"/>
               </w:rPr>
-              <w:t xml:space="preserve">2026-05-04</w:t>
+              <w:t xml:space="preserve">2026-05-06</w:t>
             </w:r>
           </w:p>
         </w:tc>
@@ -4465,7 +4465,7 @@
                 <w:sz w:val="20"/>
                 <w:szCs w:val="20"/>
               </w:rPr>
-              <w:t xml:space="preserve">13</w:t>
+              <w:t xml:space="preserve">20</w:t>
             </w:r>
           </w:p>
         </w:tc>
@@ -4499,7 +4499,7 @@
                 <w:sz w:val="20"/>
                 <w:szCs w:val="20"/>
               </w:rPr>
-              <w:t xml:space="preserve">100%</w:t>
+              <w:t xml:space="preserve">90%</w:t>
             </w:r>
           </w:p>
         </w:tc>
@@ -4533,7 +4533,7 @@
                 <w:sz w:val="20"/>
                 <w:szCs w:val="20"/>
               </w:rPr>
-              <w:t xml:space="preserve">+5.04%</w:t>
+              <w:t xml:space="preserve">+5.07%</w:t>
             </w:r>
           </w:p>
         </w:tc>
@@ -4567,7 +4567,7 @@
                 <w:sz w:val="20"/>
                 <w:szCs w:val="20"/>
               </w:rPr>
-              <w:t xml:space="preserve">85%</w:t>
+              <w:t xml:space="preserve">50%</w:t>
             </w:r>
           </w:p>
         </w:tc>
@@ -4601,7 +4601,7 @@
                 <w:sz w:val="20"/>
                 <w:szCs w:val="20"/>
               </w:rPr>
-              <w:t xml:space="preserve">+5.36%</w:t>
+              <w:t xml:space="preserve">+1.38%</w:t>
             </w:r>
           </w:p>
         </w:tc>
@@ -4690,7 +4690,7 @@
                 <w:sz w:val="20"/>
                 <w:szCs w:val="20"/>
               </w:rPr>
-              <w:t xml:space="preserve">185 樣本 / 10 天屬於小樣本，未涵蓋多空頭循環。在不同市場狀況（如連跌段、低成交量段）下，績效會有顯著差異。過去績效不代表未來。</w:t>
+              <w:t xml:space="preserve">192 樣本 / 10 天屬於小樣本，未涵蓋多空頭循環。在不同市場狀況（如連跌段、低成交量段）下，績效會有顯著差異。過去績效不代表未來。</w:t>
             </w:r>
           </w:p>
         </w:tc>
@@ -5615,7 +5615,7 @@
                 <w:sz w:val="20"/>
                 <w:szCs w:val="20"/>
               </w:rPr>
-              <w:t xml:space="preserve">✓ 185 樣本</w:t>
+              <w:t xml:space="preserve">✓ 192 樣本</w:t>
             </w:r>
           </w:p>
         </w:tc>
@@ -6192,7 +6192,7 @@
           <w:sz w:val="22"/>
           <w:szCs w:val="22"/>
         </w:rPr>
-        <w:t xml:space="preserve">主打公開揭露樣本加權回測結果（70% / 185 樣本）</w:t>
+        <w:t xml:space="preserve">主打公開揭露樣本加權回測結果（67% / 192 樣本）</w:t>
       </w:r>
     </w:p>
     <w:p>
@@ -8727,7 +8727,7 @@
           <w:sz w:val="22"/>
           <w:szCs w:val="22"/>
         </w:rPr>
-        <w:t xml:space="preserve">公開 70% 勝率、185 樣本回測，建立可驗證的差異化</w:t>
+        <w:t xml:space="preserve">公開 67% 勝率、192 樣本回測，建立可驗證的差異化</w:t>
       </w:r>
     </w:p>
     <w:p>
@@ -9644,7 +9644,7 @@
                 <w:sz w:val="20"/>
                 <w:szCs w:val="20"/>
               </w:rPr>
-              <w:t xml:space="preserve">目前回測僅 185 筆 / 10 天，未涵蓋多空頭循環。績效在不同市況下會有顯著差異。</w:t>
+              <w:t xml:space="preserve">目前回測僅 192 筆 / 10 天，未涵蓋多空頭循環。績效在不同市況下會有顯著差異。</w:t>
             </w:r>
           </w:p>
         </w:tc>

</xml_diff>